<commit_message>
Updated file with details on Phase 3
</commit_message>
<xml_diff>
--- a/RAG_pipeline_implementation_steps_a.1..docx
+++ b/RAG_pipeline_implementation_steps_a.1..docx
@@ -798,6 +798,13 @@
         </w:rPr>
         <w:t>converts source files into evidence-bearing records that later retrieval, comparison, scoring, and citation logic can reliably operate on.</w:t>
       </w:r>
+      <w:r>
+        <w:rPr>
+          <w:b/>
+          <w:bCs/>
+        </w:rPr>
+        <w:t xml:space="preserve"> Please refer to extract and structure document contents guideline manual for details on this phase.</w:t>
+      </w:r>
     </w:p>
     <w:tbl>
       <w:tblPr>
@@ -1264,6 +1271,7 @@
                 <w:b/>
                 <w:bCs/>
               </w:rPr>
+              <w:lastRenderedPageBreak/>
               <w:t>Step</w:t>
             </w:r>
           </w:p>
@@ -1366,7 +1374,6 @@
           </w:tcPr>
           <w:p>
             <w:r>
-              <w:lastRenderedPageBreak/>
               <w:t>4.2</w:t>
             </w:r>
           </w:p>
@@ -1848,6 +1855,7 @@
           </w:tcPr>
           <w:p>
             <w:r>
+              <w:lastRenderedPageBreak/>
               <w:t>5.2</w:t>
             </w:r>
           </w:p>
@@ -1889,7 +1897,6 @@
           </w:tcPr>
           <w:p>
             <w:r>
-              <w:lastRenderedPageBreak/>
               <w:t>5.3</w:t>
             </w:r>
           </w:p>
@@ -2450,6 +2457,7 @@
           </w:tcPr>
           <w:p>
             <w:r>
+              <w:lastRenderedPageBreak/>
               <w:t>6.6</w:t>
             </w:r>
           </w:p>
@@ -2491,7 +2499,6 @@
           </w:tcPr>
           <w:p>
             <w:r>
-              <w:lastRenderedPageBreak/>
               <w:t>6.7</w:t>
             </w:r>
           </w:p>
@@ -2825,6 +2832,7 @@
                 <w:b/>
                 <w:bCs/>
               </w:rPr>
+              <w:lastRenderedPageBreak/>
               <w:t>Step</w:t>
             </w:r>
           </w:p>
@@ -2968,7 +2976,6 @@
           </w:tcPr>
           <w:p>
             <w:r>
-              <w:lastRenderedPageBreak/>
               <w:t>7.3</w:t>
             </w:r>
           </w:p>
@@ -3428,6 +3435,7 @@
           </w:tcPr>
           <w:p>
             <w:r>
+              <w:lastRenderedPageBreak/>
               <w:t>8.3</w:t>
             </w:r>
           </w:p>
@@ -3510,7 +3518,6 @@
           </w:tcPr>
           <w:p>
             <w:r>
-              <w:lastRenderedPageBreak/>
               <w:t>8.5</w:t>
             </w:r>
           </w:p>
@@ -4102,6 +4109,7 @@
           </w:tcPr>
           <w:p>
             <w:r>
+              <w:lastRenderedPageBreak/>
               <w:t>U</w:t>
             </w:r>
           </w:p>
@@ -4139,7 +4147,6 @@
     </w:p>
     <w:p>
       <w:r>
-        <w:lastRenderedPageBreak/>
         <w:t>High / Medium / Low</w:t>
       </w:r>
     </w:p>
@@ -4611,6 +4618,7 @@
     </w:p>
     <w:p>
       <w:r>
+        <w:lastRenderedPageBreak/>
         <w:pict w14:anchorId="34A95F34">
           <v:rect id="_x0000_i1035" style="width:0;height:1.5pt" o:hralign="center" o:hrstd="t" o:hr="t" fillcolor="#a0a0a0" stroked="f"/>
         </w:pict>
@@ -4659,7 +4667,6 @@
         </w:numPr>
       </w:pPr>
       <w:r>
-        <w:lastRenderedPageBreak/>
         <w:t xml:space="preserve">overall submission readiness; </w:t>
       </w:r>
     </w:p>
@@ -5259,6 +5266,7 @@
         </w:numPr>
       </w:pPr>
       <w:r>
+        <w:lastRenderedPageBreak/>
         <w:t xml:space="preserve">table reference; </w:t>
       </w:r>
     </w:p>
@@ -5342,7 +5350,6 @@
                 <w:b/>
                 <w:bCs/>
               </w:rPr>
-              <w:lastRenderedPageBreak/>
               <w:t>Step</w:t>
             </w:r>
           </w:p>
@@ -5990,6 +5997,7 @@
           </w:tcPr>
           <w:p>
             <w:r>
+              <w:lastRenderedPageBreak/>
               <w:t>14.7</w:t>
             </w:r>
           </w:p>
@@ -6063,7 +6071,6 @@
     </w:tbl>
     <w:p>
       <w:r>
-        <w:lastRenderedPageBreak/>
         <w:t xml:space="preserve">The most important validation metric is the </w:t>
       </w:r>
       <w:r>

</xml_diff>